<commit_message>
Fixed save scumming and being able to click on the current room in the map.
</commit_message>
<xml_diff>
--- a/Resources/FIT1045 H+1 Submission Template.docx
+++ b/Resources/FIT1045 H+1 Submission Template.docx
@@ -1775,6 +1775,7 @@
       <w:bookmarkStart w:id="3" w:name="_heading=h.er476fkd5zoj" w:colFirst="0" w:colLast="0"/>
       <w:bookmarkEnd w:id="3"/>
       <w:r>
+        <w:lastRenderedPageBreak/>
         <w:t xml:space="preserve">Wrap Up </w:t>
       </w:r>
     </w:p>
@@ -1788,8 +1789,16 @@
         <w:t>Showcase Video Link</w:t>
       </w:r>
     </w:p>
-    <w:p/>
-    <w:p/>
+    <w:p>
+      <w:hyperlink r:id="rId10" w:history="1">
+        <w:r>
+          <w:rPr>
+            <w:rStyle w:val="Hyperlink"/>
+          </w:rPr>
+          <w:t>https://drive.google.com/file/d/1ZwpKpuOMBb0quLHUgE47yMgdWrSa5wx3/view?usp=sharing</w:t>
+        </w:r>
+      </w:hyperlink>
+    </w:p>
     <w:p>
       <w:pPr>
         <w:pStyle w:val="Heading3"/>
@@ -1800,7 +1809,11 @@
         <w:t>Link to any related resources</w:t>
       </w:r>
     </w:p>
-    <w:p/>
+    <w:p>
+      <w:r>
+        <w:t>None.</w:t>
+      </w:r>
+    </w:p>
     <w:p/>
     <w:p>
       <w:pPr>
@@ -1872,9 +1885,9 @@
       </w:r>
     </w:p>
     <w:sectPr>
-      <w:headerReference w:type="default" r:id="rId10"/>
-      <w:footerReference w:type="even" r:id="rId11"/>
-      <w:footerReference w:type="default" r:id="rId12"/>
+      <w:headerReference w:type="default" r:id="rId11"/>
+      <w:footerReference w:type="even" r:id="rId12"/>
+      <w:footerReference w:type="default" r:id="rId13"/>
       <w:pgSz w:w="11906" w:h="16838"/>
       <w:pgMar w:top="1440" w:right="1440" w:bottom="1440" w:left="1440" w:header="708" w:footer="708" w:gutter="0"/>
       <w:pgNumType w:start="1"/>
@@ -2788,6 +2801,29 @@
       <w:szCs w:val="16"/>
     </w:rPr>
   </w:style>
+  <w:style w:type="character" w:styleId="Hyperlink">
+    <w:name w:val="Hyperlink"/>
+    <w:basedOn w:val="DefaultParagraphFont"/>
+    <w:uiPriority w:val="99"/>
+    <w:unhideWhenUsed/>
+    <w:rsid w:val="005A05F8"/>
+    <w:rPr>
+      <w:color w:val="0000FF" w:themeColor="hyperlink"/>
+      <w:u w:val="single"/>
+    </w:rPr>
+  </w:style>
+  <w:style w:type="character" w:styleId="UnresolvedMention">
+    <w:name w:val="Unresolved Mention"/>
+    <w:basedOn w:val="DefaultParagraphFont"/>
+    <w:uiPriority w:val="99"/>
+    <w:semiHidden/>
+    <w:unhideWhenUsed/>
+    <w:rsid w:val="005A05F8"/>
+    <w:rPr>
+      <w:color w:val="605E5C"/>
+      <w:shd w:val="clear" w:color="auto" w:fill="E1DFDD"/>
+    </w:rPr>
+  </w:style>
 </w:styles>
 </file>
 

</xml_diff>